<commit_message>
residual version cleanup in NMI set: 7 reader-visible v33 mentions rewritten, SI title de-versioned + v33 defining note, stale md cross-references fixed
</commit_message>
<xml_diff>
--- a/docs/SPATBench_NMI_manuscript.docx
+++ b/docs/SPATBench_NMI_manuscript.docx
@@ -238,7 +238,7 @@
         <w:rPr>
           <w:b/>
         </w:rPr>
-        <w:t>Table 1. Riaz 2017: RECIST (n = 42) versus cytolytic (n = 43) response definitions (v33, HGNC-mapped). One patient lacked RECIST annotation and is excluded only from the RECIST endpoint.</w:t>
+        <w:t>Table 1. Riaz 2017: RECIST (n = 42) versus cytolytic (n = 43) response definitions (HGNC-mapped). One patient lacked RECIST annotation and is excluded only from the RECIST endpoint.</w:t>
       </w:r>
     </w:p>
     <w:tbl>
@@ -1179,7 +1179,7 @@
         <w:rPr>
           <w:b/>
         </w:rPr>
-        <w:t>Table 3. CDS with cohort-matched random-label nulls (200 replicates; declared genes GZMA/PRF1; v1.2.1). 'ML AUROC Range' = trainable methods only, v33 values. Riaz RECIST is reported on the HGNC matrix (0.409).</w:t>
+        <w:t>Table 3. CDS with cohort-matched random-label nulls (200 replicates; declared genes GZMA/PRF1; v1.2.1). 'ML AUROC Range' = trainable methods only, archived-protocol values. Riaz RECIST is reported on the HGNC matrix (0.409).</w:t>
       </w:r>
     </w:p>
     <w:tbl>
@@ -1579,7 +1579,7 @@
               <w:rPr>
                 <w:sz w:val="16"/>
               </w:rPr>
-              <w:t>Riaz 2017 RECIST (v33)</w:t>
+              <w:t>Riaz 2017 RECIST (HGNC-mapped)</w:t>
             </w:r>
           </w:p>
         </w:tc>
@@ -2009,7 +2009,7 @@
         <w:pStyle w:val="ListBullet"/>
       </w:pPr>
       <w:r>
-        <w:t>Code: All original code is publicly available. SPATBench pipeline (v33): https://github.com/huangzhixian324-dev/spa-bench (MIT). CDS package (v1.2.1): https://github.com/huangzhixian324-dev/cds (MIT); the packaged source is also included in the Zenodo archive (`cds_tool/`, installable with `pip install ./cds_tool`). A versioned archive with a DOI is deposited on Zenodo (DOI: 10.5281/zenodo.22746254). The included Dockerfile builds the image (`docker build -t spa-bench:v33 .`) that reproduces the synthetic validation test (`scripts/validate.py`, exit code 0 verified) and ships the complete pipeline code; reproducing the reported tables additionally requires the Zenodo-archived inputs and the single documented entry point `scripts/rerun_v33.py`.</w:t>
+        <w:t>Code: All original code is publicly available. SPATBench pipeline: https://github.com/huangzhixian324-dev/spa-bench (MIT). CDS package (v1.2.1): https://github.com/huangzhixian324-dev/cds (MIT); the packaged source is also included in the Zenodo archive (`cds_tool/`, installable with `pip install ./cds_tool`). A versioned archive with a DOI is deposited on Zenodo (DOI: 10.5281/zenodo.22746254). The included Dockerfile builds the image (`docker build -t spa-bench:v33 .`) that reproduces the synthetic validation test (`scripts/validate.py`, exit code 0 verified) and ships the complete pipeline code; reproducing the reported tables additionally requires the Zenodo-archived inputs and the single documented entry point `scripts/rerun_v33.py`.</w:t>
       </w:r>
     </w:p>
     <w:p>
@@ -2902,7 +2902,7 @@
         <w:t>XGBoost disclosure.</w:t>
       </w:r>
       <w:r>
-        <w:t xml:space="preserve"> XGBoost is excluded from benchmark reporting (degenerate on all clinical endpoints; its only non-degenerate AUROC sits on the circular cytolytic endpoint — development-phase evaluation only). A completed permutation matrix for XGBoost across all six cohort-endpoints (1,000 full-pipeline shuffles per cohort-endpoint, default hyperparameters, the same patient-stratified folds as every other method) confirms the pattern with a non-ElasticNet learner: null on every clinical endpoint (Hugo p = 0.29, Nathanson p = 0.17, Jung p = 0.25, Riaz RECIST p = 0.81) and significant only on the circular cytolytic endpoint (obs AUROC 0.903, p = 0.0010; Supplementary Table S16(e)). Re-examination (v33 protocol): under the current protocol XGBoost is not degenerate — re-runs produce non-degenerate predictions (Hugo 0.554, Lauss 0.493, Jung 0.611, Riaz-RECIST 0.434, Gide 0.718, and 0.991 on the circular cytolytic endpoint; all six cohorts re-run; `results/benchmark/v33/xgb_exclusion_evidence_v33.json`); it shows no signal on any clinical endpoint at n ≤ 43, so the negative claim is unaffected. A 1,000-shuffle full-pipeline permutation test of the Gide re-run (frozen hyperparameters, the Table S11 protocol) gives p = 0.004 and q = 0.007 in the within-cohort family recomputed over seven cells, with the six original Gide q-values unchanged or more conservative. This re-run is reported as exploratory — not matrix-level — evidence: XGBoost does not enter the 36-cell matrix because the development-phase prediction tables were not retained under the current protocol, its permutation resolution (1,000 shuffles) falls below the Supplementary Table S31 floor for trainable cells, and its family structure (seven cells) differs from the pre-registered six-cell families; the detectability-onset reading at n = 73 is carried by the two pre-registered ElasticNet variants, and the XGBoost re-run is consistent with — but not constitutive of — that reading. The re-run and permutation evidence files are retained for audit (permutation record: `results/benchmark/v33/nc_cells/Gide_2019_cBio__XGBoost.json`; xgboost 3.4.1) even though the prediction tables are not.</w:t>
+        <w:t xml:space="preserve"> XGBoost is excluded from benchmark reporting (degenerate on all clinical endpoints; its only non-degenerate AUROC sits on the circular cytolytic endpoint — development-phase evaluation only). A completed permutation matrix for XGBoost across all six cohort-endpoints (1,000 full-pipeline shuffles per cohort-endpoint, default hyperparameters, the same patient-stratified folds as every other method) confirms the pattern with a non-ElasticNet learner: null on every clinical endpoint (Hugo p = 0.29, Nathanson p = 0.17, Jung p = 0.25, Riaz RECIST p = 0.81) and significant only on the circular cytolytic endpoint (obs AUROC 0.903, p = 0.0010; Supplementary Table S16(e)). Re-examination (archived protocol): under the current protocol XGBoost is not degenerate — re-runs produce non-degenerate predictions (Hugo 0.554, Lauss 0.493, Jung 0.611, Riaz-RECIST 0.434, Gide 0.718, and 0.991 on the circular cytolytic endpoint; all six cohorts re-run; `results/benchmark/v33/xgb_exclusion_evidence_v33.json`); it shows no signal on any clinical endpoint at n ≤ 43, so the negative claim is unaffected. A 1,000-shuffle full-pipeline permutation test of the Gide re-run (frozen hyperparameters, the Table S11 protocol) gives p = 0.004 and q = 0.007 in the within-cohort family recomputed over seven cells, with the six original Gide q-values unchanged or more conservative. This re-run is reported as exploratory — not matrix-level — evidence: XGBoost does not enter the 36-cell matrix because the development-phase prediction tables were not retained under the current protocol, its permutation resolution (1,000 shuffles) falls below the Supplementary Table S31 floor for trainable cells, and its family structure (seven cells) differs from the pre-registered six-cell families; the detectability-onset reading at n = 73 is carried by the two pre-registered ElasticNet variants, and the XGBoost re-run is consistent with — but not constitutive of — that reading. The re-run and permutation evidence files are retained for audit (permutation record: `results/benchmark/v33/nc_cells/Gide_2019_cBio__XGBoost.json`; xgboost 3.4.1) even though the prediction tables are not.</w:t>
       </w:r>
     </w:p>
     <w:p>
@@ -3071,7 +3071,7 @@
         <w:t>Retrospective external consistency check:</w:t>
       </w:r>
       <w:r>
-        <w:t xml:space="preserve"> The Auslander et al. (2018) study provides an independent validation context for CDS. In that study, IMPRES was trained on Auslander's own data and validated externally on Hugo 2016 (RECIST endpoint), achieving AUROC = 0.83 in the original paper (0.795 in my benchmark). If CDS had been computed before that validation was performed, it would have returned CDS = 0.449 (MODERATE under the shipped thresholds, and below its cohort-matched random-label null mean of 0.586), indicating that the Hugo RECIST endpoint is not circular — any observed AUROC reflects genuine biological signal in the IMPRES gene pairs, not endpoint-gene dependency. This counterfactual application of CDS to a published external validation scenario constitutes a retrospective consistency check: CDS's reading (non-circular endpoint → AUROC not inflated by endpoint-gene dependency) is consistent with the observed outcome (IMPRES achieved significant AUROC = 0.795 on Hugo RECIST, permutation p = 0.0029). The same logic applies to Lauss 2017 (ACT) (CDS = 0.781, MODERATE under the recalibrated boundary; no trainable AUROC exceeds 0.70, no inflation). For Gide 2019 no CDS value was stored at analysis time; the v33 recomputation (Supplementary Table S4b) returns CDS = 0.852 — the C1/C2 components read the strong association between the declared genes (GZMA/PRF1) and the clinical label in this large melanoma cohort as endpoint-gene dependency, i.e. the known inability of CDS v1.x to separate genuine immune-biology signal (GEP AUROC = 0.830, q &lt; 0.001) from circularity. CDS correctness claims are therefore restricted to the endpoints with stored scores.</w:t>
+        <w:t xml:space="preserve"> The Auslander et al. (2018) study provides an independent validation context for CDS. In that study, IMPRES was trained on Auslander's own data and validated externally on Hugo 2016 (RECIST endpoint), achieving AUROC = 0.83 in the original paper (0.795 in my benchmark). If CDS had been computed before that validation was performed, it would have returned CDS = 0.449 (MODERATE under the shipped thresholds, and below its cohort-matched random-label null mean of 0.586), indicating that the Hugo RECIST endpoint is not circular — any observed AUROC reflects genuine biological signal in the IMPRES gene pairs, not endpoint-gene dependency. This counterfactual application of CDS to a published external validation scenario constitutes a retrospective consistency check: CDS's reading (non-circular endpoint → AUROC not inflated by endpoint-gene dependency) is consistent with the observed outcome (IMPRES achieved significant AUROC = 0.795 on Hugo RECIST, permutation p = 0.0029). The same logic applies to Lauss 2017 (ACT) (CDS = 0.781, MODERATE under the recalibrated boundary; no trainable AUROC exceeds 0.70, no inflation). For Gide 2019 no CDS value was stored at analysis time; the archived-protocol recomputation (Supplementary Table S4b) returns CDS = 0.852 — the C1/C2 components read the strong association between the declared genes (GZMA/PRF1) and the clinical label in this large melanoma cohort as endpoint-gene dependency, i.e. the known inability of CDS v1.x to separate genuine immune-biology signal (GEP AUROC = 0.830, q &lt; 0.001) from circularity. CDS correctness claims are therefore restricted to the endpoints with stored scores.</w:t>
       </w:r>
     </w:p>
     <w:p>
@@ -3202,7 +3202,7 @@
         <w:jc w:val="both"/>
       </w:pPr>
       <w:r>
-        <w:t>Supplementary Information is provided as a separate PDF (Markdown source `supplementary_nmi_v1.md`, assembled from the machine-readable outputs in `results/benchmark/v33/`). Contents:</w:t>
+        <w:t>Supplementary Information is provided as a separate PDF (Markdown source `supplementary_nmi.md`, assembled from the machine-readable outputs in `results/benchmark/v33/`). Contents:</w:t>
       </w:r>
     </w:p>
     <w:p>
@@ -3496,7 +3496,7 @@
         <w:t>Figure 1. Response-definition collapse on Riaz 2017.</w:t>
       </w:r>
       <w:r>
-        <w:t xml:space="preserve"> AUROC per method on the same patients under the cytolytic-surrogate endpoint versus the clinical RECIST endpoint (HGNC-mapped matrix, v33; 95% bootstrap CIs). Every method whose feature set overlaps the endpoint-defining genes (GZMA/PRF1) collapses; IMPRES, with no overlap, is nearly insensitive. The identical file is provided as Supplementary Figure S1.</w:t>
+        <w:t xml:space="preserve"> AUROC per method on the same patients under the cytolytic-surrogate endpoint versus the clinical RECIST endpoint (HGNC-mapped matrix; 95% bootstrap CIs). Every method whose feature set overlaps the endpoint-defining genes (GZMA/PRF1) collapses; IMPRES, with no overlap, is nearly insensitive. The identical file is provided as Supplementary Figure S1.</w:t>
       </w:r>
     </w:p>
     <w:p>

</xml_diff>